<commit_message>
Deploy preview for PR 11 🛫
</commit_message>
<xml_diff>
--- a/pr-preview/pr-11/chapters/chapter1-tracked-changes.docx
+++ b/pr-preview/pr-11/chapters/chapter1-tracked-changes.docx
@@ -548,7 +548,7 @@
       </w:ins>
       <w:ins w:id="22" w:author="PR Preview" w:date="2024-01-01T00:00:00Z">
         <w:r>
-          <w:t xml:space="preserve">9b1200b</w:t>
+          <w:t xml:space="preserve">5d1962d</w:t>
         </w:r>
       </w:ins>
     </w:p>
@@ -576,7 +576,7 @@
       </w:ins>
       <w:ins w:id="23" w:author="PR Preview" w:date="2024-01-01T00:00:00Z">
         <w:r>
-          <w:t xml:space="preserve">9b1200bc44043b08860f6f2605c6d20f4e7767b5</w:t>
+          <w:t xml:space="preserve">5d1962deb609ec7e33762a94ce1c809d63b40afa</w:t>
         </w:r>
       </w:ins>
     </w:p>
@@ -604,7 +604,7 @@
       </w:ins>
       <w:ins w:id="24" w:author="PR Preview" w:date="2024-01-01T00:00:00Z">
         <w:r>
-          <w:t xml:space="preserve">2026-04-06 18:12:08 -0700</w:t>
+          <w:t xml:space="preserve">2026-04-08 14:23:15 -0700</w:t>
         </w:r>
       </w:ins>
     </w:p>

</xml_diff>